<commit_message>
docs: api docs update
</commit_message>
<xml_diff>
--- a/docs/EatSafe_API_Documentation.docx
+++ b/docs/EatSafe_API_Documentation.docx
@@ -169,7 +169,19 @@
         <w:rPr>
           <w:lang w:val="en-US"/>
         </w:rPr>
-        <w:t>Filtering warnings precisely using custom search parameters (e.g., by brand, danger type, or product name).</w:t>
+        <w:t>Filtering warnings precisely using custom search parameters (e.g., by brand, danger type, product name</w:t>
+      </w:r>
+      <w:r>
+        <w:rPr>
+          <w:lang w:val="en-US"/>
+        </w:rPr>
+        <w:t>, publication date</w:t>
+      </w:r>
+      <w:r>
+        <w:rPr>
+          <w:lang w:val="en-US"/>
+        </w:rPr>
+        <w:t>).</w:t>
       </w:r>
     </w:p>
     <w:p>
@@ -336,42 +348,21 @@
       </w:r>
       <w:r>
         <w:rPr>
-          <w:b/>
-          <w:bCs/>
-          <w:sz w:val="40"/>
-          <w:szCs w:val="40"/>
-          <w:lang w:val="en-US"/>
+          <w:noProof/>
         </w:rPr>
         <w:lastRenderedPageBreak/>
-        <w:t>Warnings Endpoints</w:t>
-      </w:r>
-    </w:p>
-    <w:p>
-      <w:pPr>
-        <w:rPr>
-          <w:b/>
-          <w:bCs/>
-          <w:sz w:val="28"/>
-          <w:szCs w:val="28"/>
-          <w:lang w:val="en-US"/>
-        </w:rPr>
-      </w:pPr>
-      <w:r>
-        <w:rPr>
-          <w:noProof/>
-        </w:rPr>
         <mc:AlternateContent>
           <mc:Choice Requires="wps">
             <w:drawing>
-              <wp:anchor distT="0" distB="0" distL="114300" distR="114300" simplePos="0" relativeHeight="251667456" behindDoc="0" locked="0" layoutInCell="1" allowOverlap="1" wp14:anchorId="2FE84319" wp14:editId="134A2353">
+              <wp:anchor distT="0" distB="0" distL="114300" distR="114300" simplePos="0" relativeHeight="251667456" behindDoc="0" locked="0" layoutInCell="1" allowOverlap="1" wp14:anchorId="2FE84319" wp14:editId="1CD96169">
                 <wp:simplePos x="0" y="0"/>
                 <wp:positionH relativeFrom="margin">
                   <wp:align>center</wp:align>
                 </wp:positionH>
                 <wp:positionV relativeFrom="paragraph">
-                  <wp:posOffset>106243</wp:posOffset>
+                  <wp:posOffset>465455</wp:posOffset>
                 </wp:positionV>
-                <wp:extent cx="6353299" cy="0"/>
+                <wp:extent cx="6353175" cy="0"/>
                 <wp:effectExtent l="0" t="0" r="0" b="0"/>
                 <wp:wrapNone/>
                 <wp:docPr id="1349777328" name="Łącznik prosty 2"/>
@@ -383,7 +374,7 @@
                       <wps:spPr>
                         <a:xfrm>
                           <a:off x="0" y="0"/>
-                          <a:ext cx="6353299" cy="0"/>
+                          <a:ext cx="6353175" cy="0"/>
                         </a:xfrm>
                         <a:prstGeom prst="line">
                           <a:avLst/>
@@ -412,7 +403,7 @@
           </mc:Choice>
           <mc:Fallback>
             <w:pict>
-              <v:line w14:anchorId="1B39DDB4" id="Łącznik prosty 2" o:spid="_x0000_s1026" style="position:absolute;z-index:251667456;visibility:visible;mso-wrap-style:square;mso-wrap-distance-left:9pt;mso-wrap-distance-top:0;mso-wrap-distance-right:9pt;mso-wrap-distance-bottom:0;mso-position-horizontal:center;mso-position-horizontal-relative:margin;mso-position-vertical:absolute;mso-position-vertical-relative:text" from="0,8.35pt" to="500.25pt,8.35pt" o:gfxdata="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" strokecolor="#156082 [3204]" strokeweight="1.5pt">
+              <v:line w14:anchorId="0F4AD37A" id="Łącznik prosty 2" o:spid="_x0000_s1026" style="position:absolute;z-index:251667456;visibility:visible;mso-wrap-style:square;mso-wrap-distance-left:9pt;mso-wrap-distance-top:0;mso-wrap-distance-right:9pt;mso-wrap-distance-bottom:0;mso-position-horizontal:center;mso-position-horizontal-relative:margin;mso-position-vertical:absolute;mso-position-vertical-relative:text" from="0,36.65pt" to="500.25pt,36.65pt" o:gfxdata="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" strokecolor="#156082 [3204]" strokeweight="1.5pt">
                 <v:stroke joinstyle="miter"/>
                 <w10:wrap anchorx="margin"/>
               </v:line>
@@ -420,12 +411,24 @@
           </mc:Fallback>
         </mc:AlternateContent>
       </w:r>
-    </w:p>
-    <w:p>
-      <w:pPr>
-        <w:rPr>
-          <w:b/>
-          <w:bCs/>
+      <w:r>
+        <w:rPr>
+          <w:b/>
+          <w:bCs/>
+          <w:sz w:val="40"/>
+          <w:szCs w:val="40"/>
+          <w:lang w:val="en-US"/>
+        </w:rPr>
+        <w:t>Warnings Endpoints</w:t>
+      </w:r>
+    </w:p>
+    <w:p>
+      <w:pPr>
+        <w:rPr>
+          <w:b/>
+          <w:bCs/>
+          <w:sz w:val="28"/>
+          <w:szCs w:val="28"/>
           <w:lang w:val="en-US"/>
         </w:rPr>
       </w:pPr>
@@ -683,6 +686,15 @@
       </w:r>
     </w:p>
     <w:p>
+      <w:pPr>
+        <w:rPr>
+          <w:b/>
+          <w:bCs/>
+          <w:color w:val="196B24" w:themeColor="accent3"/>
+          <w:sz w:val="32"/>
+          <w:szCs w:val="32"/>
+        </w:rPr>
+      </w:pPr>
       <w:r>
         <w:rPr>
           <w:noProof/>
@@ -690,13 +702,13 @@
         <mc:AlternateContent>
           <mc:Choice Requires="wps">
             <w:drawing>
-              <wp:anchor distT="0" distB="0" distL="114300" distR="114300" simplePos="0" relativeHeight="251659264" behindDoc="0" locked="0" layoutInCell="1" allowOverlap="1" wp14:anchorId="469CE2B6" wp14:editId="52C5014A">
+              <wp:anchor distT="0" distB="0" distL="114300" distR="114300" simplePos="0" relativeHeight="251659264" behindDoc="0" locked="0" layoutInCell="1" allowOverlap="1" wp14:anchorId="469CE2B6" wp14:editId="771DFBB0">
                 <wp:simplePos x="0" y="0"/>
                 <wp:positionH relativeFrom="margin">
                   <wp:align>center</wp:align>
                 </wp:positionH>
                 <wp:positionV relativeFrom="paragraph">
-                  <wp:posOffset>174245</wp:posOffset>
+                  <wp:posOffset>152689</wp:posOffset>
                 </wp:positionV>
                 <wp:extent cx="6353299" cy="0"/>
                 <wp:effectExtent l="0" t="0" r="0" b="0"/>
@@ -739,7 +751,7 @@
           </mc:Choice>
           <mc:Fallback>
             <w:pict>
-              <v:line w14:anchorId="634D2434" id="Łącznik prosty 2" o:spid="_x0000_s1026" style="position:absolute;z-index:251659264;visibility:visible;mso-wrap-style:square;mso-wrap-distance-left:9pt;mso-wrap-distance-top:0;mso-wrap-distance-right:9pt;mso-wrap-distance-bottom:0;mso-position-horizontal:center;mso-position-horizontal-relative:margin;mso-position-vertical:absolute;mso-position-vertical-relative:text" from="0,13.7pt" to="500.25pt,13.7pt" o:gfxdata="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" strokecolor="#156082 [3204]" strokeweight="1.5pt">
+              <v:line w14:anchorId="5E144F91" id="Łącznik prosty 2" o:spid="_x0000_s1026" style="position:absolute;z-index:251659264;visibility:visible;mso-wrap-style:square;mso-wrap-distance-left:9pt;mso-wrap-distance-top:0;mso-wrap-distance-right:9pt;mso-wrap-distance-bottom:0;mso-position-horizontal:center;mso-position-horizontal-relative:margin;mso-position-vertical:absolute;mso-position-vertical-relative:text" from="0,12pt" to="500.25pt,12pt" o:gfxdata="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" strokecolor="#156082 [3204]" strokeweight="1.5pt">
                 <v:stroke joinstyle="miter"/>
                 <w10:wrap anchorx="margin"/>
               </v:line>
@@ -883,6 +895,10 @@
           <w:ilvl w:val="0"/>
           <w:numId w:val="3"/>
         </w:numPr>
+        <w:jc w:val="both"/>
+        <w:rPr>
+          <w:lang w:val="en-US"/>
+        </w:rPr>
       </w:pPr>
       <w:r>
         <w:rPr>
@@ -896,31 +912,27 @@
         <w:rPr>
           <w:lang w:val="en-US"/>
         </w:rPr>
-        <w:t xml:space="preserve"> Filters the warnings database based on specific criteria. Multiple filters can be combined (acting as a logical AND). </w:t>
-      </w:r>
-      <w:proofErr w:type="spellStart"/>
-      <w:r>
-        <w:t>Matches</w:t>
-      </w:r>
-      <w:proofErr w:type="spellEnd"/>
-      <w:r>
         <w:t xml:space="preserve"> </w:t>
       </w:r>
-      <w:proofErr w:type="spellStart"/>
-      <w:r>
-        <w:t>are</w:t>
-      </w:r>
-      <w:proofErr w:type="spellEnd"/>
-      <w:r>
-        <w:t xml:space="preserve"> </w:t>
-      </w:r>
-      <w:proofErr w:type="spellStart"/>
-      <w:r>
-        <w:t>case-insensitive</w:t>
-      </w:r>
-      <w:proofErr w:type="spellEnd"/>
-      <w:r>
-        <w:t>.</w:t>
+      <w:r>
+        <w:rPr>
+          <w:lang w:val="en-US"/>
+        </w:rPr>
+        <w:t xml:space="preserve">Filters the warnings database based on specific criteria. Multiple filters can be combined (acting as a logical AND). Text matches are case-insensitive. </w:t>
+      </w:r>
+      <w:proofErr w:type="gramStart"/>
+      <w:r>
+        <w:rPr>
+          <w:lang w:val="en-US"/>
+        </w:rPr>
+        <w:t>Implements</w:t>
+      </w:r>
+      <w:proofErr w:type="gramEnd"/>
+      <w:r>
+        <w:rPr>
+          <w:lang w:val="en-US"/>
+        </w:rPr>
+        <w:t xml:space="preserve"> date range validation to prevent illogical or future-dated queries.</w:t>
       </w:r>
     </w:p>
     <w:p>
@@ -1106,6 +1118,56 @@
     <w:p>
       <w:pPr>
         <w:numPr>
+          <w:ilvl w:val="1"/>
+          <w:numId w:val="3"/>
+        </w:numPr>
+        <w:rPr>
+          <w:lang w:val="en-US"/>
+        </w:rPr>
+      </w:pPr>
+      <w:proofErr w:type="spellStart"/>
+      <w:r>
+        <w:rPr>
+          <w:lang w:val="en-US"/>
+        </w:rPr>
+        <w:t>date_from</w:t>
+      </w:r>
+      <w:proofErr w:type="spellEnd"/>
+      <w:r>
+        <w:rPr>
+          <w:lang w:val="en-US"/>
+        </w:rPr>
+        <w:t xml:space="preserve"> (string, optional) - Filters warnings published on or after this date. Expected format: YYYY-MM-DD.</w:t>
+      </w:r>
+    </w:p>
+    <w:p>
+      <w:pPr>
+        <w:numPr>
+          <w:ilvl w:val="1"/>
+          <w:numId w:val="3"/>
+        </w:numPr>
+        <w:rPr>
+          <w:lang w:val="en-US"/>
+        </w:rPr>
+      </w:pPr>
+      <w:proofErr w:type="spellStart"/>
+      <w:r>
+        <w:rPr>
+          <w:lang w:val="en-US"/>
+        </w:rPr>
+        <w:t>date_to</w:t>
+      </w:r>
+      <w:proofErr w:type="spellEnd"/>
+      <w:r>
+        <w:rPr>
+          <w:lang w:val="en-US"/>
+        </w:rPr>
+        <w:t xml:space="preserve"> (string, optional) - Filters warnings published on or before this date. Expected format: YYYY-MM-DD.</w:t>
+      </w:r>
+    </w:p>
+    <w:p>
+      <w:pPr>
+        <w:numPr>
           <w:ilvl w:val="0"/>
           <w:numId w:val="3"/>
         </w:numPr>
@@ -1152,17 +1214,14 @@
       <w:r>
         <w:t xml:space="preserve"> 200 OK</w:t>
       </w:r>
-    </w:p>
-    <w:p>
-      <w:pPr>
-        <w:rPr>
-          <w:b/>
-          <w:bCs/>
-          <w:color w:val="196B24" w:themeColor="accent3"/>
-          <w:sz w:val="32"/>
-          <w:szCs w:val="32"/>
-        </w:rPr>
-      </w:pPr>
+      <w:r>
+        <w:t xml:space="preserve">, 400 Bad </w:t>
+      </w:r>
+      <w:proofErr w:type="spellStart"/>
+      <w:r>
+        <w:t>Request</w:t>
+      </w:r>
+      <w:proofErr w:type="spellEnd"/>
       <w:r>
         <w:rPr>
           <w:noProof/>
@@ -1227,28 +1286,6 @@
           </mc:Fallback>
         </mc:AlternateContent>
       </w:r>
-    </w:p>
-    <w:p>
-      <w:pPr>
-        <w:rPr>
-          <w:b/>
-          <w:bCs/>
-          <w:color w:val="196B24" w:themeColor="accent3"/>
-          <w:sz w:val="32"/>
-          <w:szCs w:val="32"/>
-        </w:rPr>
-      </w:pPr>
-    </w:p>
-    <w:p>
-      <w:pPr>
-        <w:rPr>
-          <w:b/>
-          <w:bCs/>
-          <w:color w:val="196B24" w:themeColor="accent3"/>
-          <w:sz w:val="32"/>
-          <w:szCs w:val="32"/>
-        </w:rPr>
-      </w:pPr>
     </w:p>
     <w:p>
       <w:pPr>
@@ -6525,6 +6562,7 @@
   <w:style w:type="character" w:default="1" w:styleId="Domylnaczcionkaakapitu">
     <w:name w:val="Default Paragraph Font"/>
     <w:uiPriority w:val="1"/>
+    <w:semiHidden/>
     <w:unhideWhenUsed/>
   </w:style>
   <w:style w:type="table" w:default="1" w:styleId="Standardowy">

</xml_diff>